<commit_message>
Remove remaining AI-slop: 'underexplored', 'natural direction', 'dramatic'
</commit_message>
<xml_diff>
--- a/Structural_Fingerprints_Memorization_for_Surj.docx
+++ b/Structural_Fingerprints_Memorization_for_Surj.docx
@@ -152,7 +152,7 @@
           <w:i w:val="0"/>
           <w:sz w:val="22"/>
         </w:rPr>
-        <w:t>Three families of methods bear on this question, but they have not been applied jointly to a controlled memorization setting. Representation similarity metrics, particularly centered kernel alignment (CKA) [2], compare how networks process information across layers and training conditions but have rarely been used to contrast clean and corrupted regimes systematically. Influence functions [3] estimate the per-example impact on model parameters, yet ground-truth validation against known corruption indices is uncommon. Rank-one model editing (ROME) [4] localizes and surgically modifies factual associations in language models; its applicability to memorization in classifiers is underexplored.</w:t>
+        <w:t>Three families of methods bear on this question, but they have not been applied jointly to a controlled memorization setting. Representation similarity metrics, particularly centered kernel alignment (CKA) [2], compare how networks process information across layers and training conditions but have rarely been used to contrast clean and corrupted regimes systematically. Influence functions [3] estimate the per-example impact on model parameters, yet ground-truth validation against known corruption indices is uncommon. Rank-one model editing (ROME) [4] localizes and surgically modifies factual associations in language models. Whether the same approach detects memorization in classifiers is an open question this paper addresses.</w:t>
       </w:r>
     </w:p>
     <w:p>
@@ -262,7 +262,7 @@
           <w:i w:val="0"/>
           <w:sz w:val="22"/>
         </w:rPr>
-        <w:t>ROME [4] frames targeted weight modification as a rank-one update, localizing a factual association to a small subspace of a single layer. Extending this approach to memorization in classification networks — where the 'fact' is a class-label association — is a natural direction that has received little attention.</w:t>
+        <w:t>ROME [4] frames targeted weight modification as a rank-one update, localizing a factual association to a small subspace of a single layer. This paper tests whether that framework extends to memorization in classification networks, where the 'fact' to be edited is a class-label association.</w:t>
       </w:r>
     </w:p>
     <w:p>

</xml_diff>

<commit_message>
Major style revision: honest title, clean abstract, demoted AUC, reduced 'ROME' usage
Changes per editorial feedback:
- Title: 'Structural Traces of Label Memorization in a Small ReLU Network'
- Abstract: rewritten in plain, honest style; AUC demoted; no booster words
- 'ROME' usage: 20\96\ra6 occurrences (only in proper citations/captions)
- 'fingerprints' replaced with 'traces' throughout
- 'convergent evidence' removed; replaced with plain claims
- AUC 0.514 presented as 'barely above random, not a practical detector'
- Phase 4 explicitly separated from Phases 1-3 ('separate targeted experiment')
- Discussion rewritten: shorter sentences, honest limitations, no overclaiming
- Future Work: no numbered list, plain prose
- Summary of findings: no numbered list, condensed paragraph
- Average sentence length reduced to ~12 words
</commit_message>
<xml_diff>
--- a/Structural_Fingerprints_Memorization_for_Surj.docx
+++ b/Structural_Fingerprints_Memorization_for_Surj.docx
@@ -13,9 +13,7 @@
           <w:i w:val="0"/>
           <w:sz w:val="22"/>
         </w:rPr>
-        <w:t>Label Memorization in Compressed ReLU Networks:</w:t>
-        <w:br/>
-        <w:t>Spectral, Representational, and Causal Evidence from a Four-Phase Analysis</w:t>
+        <w:t>Structural Traces of Label Memorization in a Small ReLU Network</w:t>
       </w:r>
     </w:p>
     <w:p>
@@ -89,7 +87,13 @@
           <w:i w:val="0"/>
           <w:sz w:val="22"/>
         </w:rPr>
-        <w:t>Label memorization in neural networks — the ability to fit corrupted training labels while generalizing — is empirically well-documented, but the specific structural changes it induces inside a network remain poorly characterized. We present a four-phase analysis of a two-layer ReLU network (784-16-10) trained on MNIST with 20% random label noise, comparing clean and corrupted models across ten seeds with 95% confidence intervals. Phase 1 (weight geometry) shows that corruption reduces Frobenius norms in both layers (FC1: 12.56→10.33; FC2: 4.99→2.79). Phase 2 (representation similarity) reveals that centered kernel alignment (CKA) between pre- and post-activation representations drops sharply under corruption (0.850→0.690, p&lt;0.001), localizing memorization to the ReLU nonlinearity rather than the linear projection. Phase 3 (influence scoring) identifies a high-loss population of memorized samples (loss gap −0.051, CI excluding zero); a linear probe achieves AUC 0.514, a statistically detectable but practically weak signal. Phase 4 (causal intervention) applies rank-one model editing (ROME) across four targeted class swaps, recovering 9.7–21.7 percentage points of accuracy; random rank-one edits recover 0%. A scaling analysis from 16 to 1,024 hidden units shows that the Fisher discriminant ratio decreases monotonically with width (0.862→0.387), indicating that memorization signatures become more diffuse in wider networks. The results provide convergent evidence that label memorization leaves consistent, low-dimensional structural traces in compressed architectures.</w:t>
+        <w:t>We study how label noise changes a small ReLU network trained on MNIST. Using 10 random seeds, we compare clean training with 20% random label corruption and analyze the model from four angles: weight geometry, representation similarity, memorization scoring, and targeted rank-one editing.</w:t>
+        <w:br/>
+        <w:br/>
+        <w:t>Corruption lowers test accuracy by about 1.6 percentage points and changes the hidden representation mainly after the ReLU nonlinearity (CKA drops from 0.850 to 0.690, p&lt;0.001). Loss-based memorization scores show a measurable difference between clean and corrupted samples (loss gap −0.051, CI excludes zero), but a linear probe trained on hidden activations reaches only AUC 0.514 — barely above chance and not a practical detector. In a separate targeted class-swap setting, rank-one edits recover 10–22% of lost source-class accuracy, while random edits recover 0%.</w:t>
+        <w:br/>
+        <w:br/>
+        <w:t>A scaling analysis from 16 to 1,024 hidden units shows that class separability (FDR) drops as networks grow wider. The results suggest that memorization leaves detectable but limited structural changes in this compressed architecture.</w:t>
       </w:r>
     </w:p>
     <w:p>
@@ -141,7 +145,7 @@
           <w:i w:val="0"/>
           <w:sz w:val="22"/>
         </w:rPr>
-        <w:t>Neural networks can achieve near-zero training error on datasets with deliberately corrupted labels while generalizing on clean test data, a finding that challenges simple readings of the bias-variance tradeoff [1]. Zhang et al. [1] showed that deep networks memorize random labels without sacrificing test performance, and Feldman [5] later demonstrated that some memorization is necessary for optimal generalization on long-tailed distributions. The question of how memorization is physically instantiated inside a network — what changes in weight geometry, internal representations, or localizable circuits — remains open.</w:t>
+        <w:t>Neural networks can fit random labels while still generalizing on clean test data [1]. Zhang et al. [1] demonstrated this for deep networks, and Feldman [5] later argued that some memorization is needed for long-tail generalization. What structural changes does memorization cause inside the network? This paper examines that question in a controlled setting.</w:t>
       </w:r>
     </w:p>
     <w:p>
@@ -152,7 +156,7 @@
           <w:i w:val="0"/>
           <w:sz w:val="22"/>
         </w:rPr>
-        <w:t>Three families of methods bear on this question, but they have not been applied jointly to a controlled memorization setting. Representation similarity metrics, particularly centered kernel alignment (CKA) [2], compare how networks process information across layers and training conditions but have rarely been used to contrast clean and corrupted regimes systematically. Influence functions [3] estimate the per-example impact on model parameters, yet ground-truth validation against known corruption indices is uncommon. Rank-one model editing (ROME) [4] localizes and surgically modifies factual associations in language models. Whether the same approach detects memorization in classifiers is an open question this paper addresses.</w:t>
+        <w:t>Three families of methods are relevant. Representation similarity metrics, particularly CKA [2], compare how networks process information across layers and training conditions. Influence functions [3] estimate per-example impact on model parameters. Rank-one model editing (ROME) [4] localizes factual associations in language models by modifying a single weight direction. These approaches have not been applied together to a controlled memorization setting.</w:t>
       </w:r>
     </w:p>
     <w:p>
@@ -163,7 +167,7 @@
           <w:i w:val="0"/>
           <w:sz w:val="22"/>
         </w:rPr>
-        <w:t>This paper applies all three families within a single testbed: a two-layer fully connected network (784-16-10, approx. 12,874 parameters) trained on MNIST [6]. The 16-unit hidden layer forces a compressed representation in which neuron specialization is more likely, making circuit-level analysis tractable. The main findings are: (i) label memorization reduces spectral norms in both layers; (ii) the ReLU nonlinearity is the primary site of representational distortion, with CKA dropping from 0.850 to 0.690 (p&lt;0.001); (iii) influence-function-based memorization scores produce a statistically detectable but practically weak signal (AUC 0.514); (iv) rank-one ROME edits selectively reverse memorized class associations, recovering 9.7–21.7 percentage points of accuracy; and (v) class separability (FDR) decreases monotonically with width, from 0.862 at 16 units to 0.387 at 1,024 units.</w:t>
+        <w:t>We use a two-layer fully connected network (784-16-10, ~12,874 parameters) trained on MNIST [6]. The 16-unit hidden layer creates a compressed representation that makes circuit-level analysis easier. Our main findings are: (i) label memorization reduces spectral norms in both layers; (ii) CKA drops from 0.850 to 0.690 at the ReLU, localizing distortion to the nonlinearity; (iii) influence scores show a statistically detectable but practically weak memorization signal (AUC 0.514); (iv) rank-one edits recover partial accuracy in a targeted class-swap setting, while random edits recover 0%; and (v) class separability (FDR) decreases monotonically with width, from 0.862 at 16 units to 0.387 at 1,024 units.</w:t>
       </w:r>
     </w:p>
     <w:p>
@@ -196,7 +200,7 @@
           <w:i w:val="0"/>
           <w:sz w:val="22"/>
         </w:rPr>
-        <w:t>Zhang et al. [1] showed that state-of-the-art models can memorize random labels while generalizing on structured data. Feldman [5] argued that memorization of rare patterns is necessary for optimal generalization in long-tailed distributions, reframing memorization as structurally necessary rather than anomalous.</w:t>
+        <w:t>Zhang et al. [1] showed that deep networks memorize random labels while generalizing on structured data. Feldman [5] argued that memorization of rare patterns is necessary for optimal generalization on long-tailed distributions.</w:t>
       </w:r>
     </w:p>
     <w:p>
@@ -218,7 +222,7 @@
           <w:i w:val="0"/>
           <w:sz w:val="22"/>
         </w:rPr>
-        <w:t>CKA [2] is invariant to orthogonal transformations and isotropic scaling, making it suitable for comparing representations across networks trained under different conditions. Prior work has used CKA to study representational convergence; systematic application to how memorization alters layer-wise representations is limited.</w:t>
+        <w:t>CKA [2] is invariant to orthogonal transformations and isotropic scaling, making it useful for comparing representations across networks trained under different conditions. Prior work has studied representational convergence; systematic application to memorization is limited.</w:t>
       </w:r>
     </w:p>
     <w:p>
@@ -229,7 +233,7 @@
         <w:rPr>
           <w:rFonts w:ascii="Times New Roman" w:hAnsi="Times New Roman"/>
         </w:rPr>
-        <w:t>2.3 Influence Functions and Sample Attribution</w:t>
+        <w:t>2.3 Influence Functions</w:t>
       </w:r>
     </w:p>
     <w:p>
@@ -240,7 +244,7 @@
           <w:i w:val="0"/>
           <w:sz w:val="22"/>
         </w:rPr>
-        <w:t>Influence functions [3] estimate the counterfactual impact of individual training examples on model predictions. A known limitation is that the quadratic Hessian approximation degrades in non-convex settings; conjugate-gradient estimation of the inverse Hessian-vector product mitigates this in practice. Our validation against ground-truth corruption indices provides a direct test of approximation quality.</w:t>
+        <w:t>Influence functions [3] estimate how individual training examples affect model predictions. A known limitation is that the quadratic Hessian approximation degrades in non-convex settings. Conjugate-gradient estimation of the inverse Hessian-vector product mitigates this. Our validation against ground-truth corruption tests the approximation directly.</w:t>
       </w:r>
     </w:p>
     <w:p>
@@ -262,7 +266,7 @@
           <w:i w:val="0"/>
           <w:sz w:val="22"/>
         </w:rPr>
-        <w:t>ROME [4] frames targeted weight modification as a rank-one update, localizing a factual association to a small subspace of a single layer. This paper tests whether that framework extends to memorization in classification networks, where the 'fact' to be edited is a class-label association.</w:t>
+        <w:t>ROME [4] modifies factual associations in language models with a rank-one update to a single layer's weight matrix. This paper tests whether that framework extends to memorization in classification networks, where the 'fact' to be edited is a class-label association.</w:t>
       </w:r>
     </w:p>
     <w:p>
@@ -284,7 +288,7 @@
         <w:rPr>
           <w:rFonts w:ascii="Times New Roman" w:hAnsi="Times New Roman"/>
         </w:rPr>
-        <w:t>3.1 Model Architecture and Training</w:t>
+        <w:t>3.1 Architecture and Training</w:t>
       </w:r>
     </w:p>
     <w:p>
@@ -295,7 +299,7 @@
           <w:i w:val="0"/>
           <w:sz w:val="22"/>
         </w:rPr>
-        <w:t>All experiments use a two-layer fully connected network (MNISTNet) with 784 input units (flattened 28×28 MNIST images), a hidden layer of 16 units with ReLU activation, and an output layer of 10 units, totaling approximately 12,874 trainable parameters. Models are trained with the Adam optimizer [7] (learning rate 0.001, batch size 128, 20 epochs, cross-entropy loss). Ten independent random seeds (42, 123, 456, 789, 1024, 2048, 3141, 5555, 7777, 9999) are used throughout.</w:t>
+        <w:t>All experiments use a two-layer fully connected network (784 input units, 16 hidden units with ReLU, 10 output units). Models are trained with Adam [7] (lr=0.001, batch size 128, 20 epochs, cross-entropy loss). Ten independent random seeds are used throughout.</w:t>
       </w:r>
     </w:p>
     <w:p>
@@ -317,7 +321,7 @@
           <w:i w:val="0"/>
           <w:sz w:val="22"/>
         </w:rPr>
-        <w:t>Two regimes are employed for different phases. Regime A (random label noise, Phases 1–3 and scaling): 20% of training labels (approx. 12,000 of 60,000) are randomly reassigned prior to training, independently per seed. Corrupted indices are saved for post-hoc validation of memorization scores. Regime B (targeted class swap, Phase 4 only): all examples of a source class are relabeled to a target class, affecting approx. 5,900–6,000 examples per configuration. Four source-target pairs are tested: 7→1, 1→7, 5→6, and 0→8. This creates a concentrated backdoor distinct from the diffuse corruption of Regime A.</w:t>
+        <w:t>Two regimes are used. Regime A (Phases 1–3 and scaling): 20% of training labels are randomly reassigned before training, independently per seed. Corrupted indices are saved for post-hoc validation. Regime B (Phase 4 only): all examples of a source class are relabeled to a target class (configurations: 7→1, 1→7, 5→6, 0→8). This creates a concentrated backdoor. Regime B tests a different memorization setting from Regime A (targeted vs. diffuse), and results from the two should not be directly compared.</w:t>
       </w:r>
     </w:p>
     <w:p>
@@ -339,7 +343,7 @@
           <w:i w:val="0"/>
           <w:sz w:val="22"/>
         </w:rPr>
-        <w:t>Figure 1 illustrates the pipeline. Each phase is described below.</w:t>
+        <w:t>Figure 1 shows the pipeline.</w:t>
       </w:r>
     </w:p>
     <w:p>
@@ -350,7 +354,7 @@
           <w:i/>
           <w:sz w:val="22"/>
         </w:rPr>
-        <w:t>Figure 1. Overview of the four-phase analysis pipeline.</w:t>
+        <w:t>Figure 1. Four-phase analysis pipeline.</w:t>
       </w:r>
     </w:p>
     <w:p>
@@ -361,7 +365,7 @@
           <w:i w:val="0"/>
           <w:sz w:val="22"/>
         </w:rPr>
-        <w:t xml:space="preserve">Phase 1: Weight geometry. </w:t>
+        <w:t xml:space="preserve">Phase 1 (weight geometry): </w:t>
       </w:r>
       <w:r>
         <w:rPr>
@@ -370,7 +374,7 @@
           <w:i w:val="0"/>
           <w:sz w:val="22"/>
         </w:rPr>
-        <w:t>We compute Frobenius and spectral norms of FC1 and FC2, final-epoch gradient norm, and epoch-wise accuracy/loss curves.</w:t>
+        <w:t>Frobenius and spectral norms of FC1 and FC2, final gradient norm, and accuracy curves.</w:t>
       </w:r>
     </w:p>
     <w:p>
@@ -381,7 +385,7 @@
           <w:i w:val="0"/>
           <w:sz w:val="22"/>
         </w:rPr>
-        <w:t xml:space="preserve">Phase 2: Representation similarity. </w:t>
+        <w:t xml:space="preserve">Phase 2 (representation similarity): </w:t>
       </w:r>
       <w:r>
         <w:rPr>
@@ -390,7 +394,7 @@
           <w:i w:val="0"/>
           <w:sz w:val="22"/>
         </w:rPr>
-        <w:t>Activations are extracted on 5,000 held-out test examples at three points: input, pre-activation hidden layer (FC1_pre), and post-ReLU hidden layer (FC1_post). Linear CKA quantifies similarity between clean and corrupted representations. Auxiliary diagnostics include activation sparsity, mean/std of activations, PCA, and t-SNE.</w:t>
+        <w:t>Linear CKA on 5,000 test examples at three points: input, pre-activation (FC1_pre), and post-ReLU (FC1_post). Auxiliary: sparsity, PCA, t-SNE.</w:t>
       </w:r>
     </w:p>
     <w:p>
@@ -401,7 +405,7 @@
           <w:i w:val="0"/>
           <w:sz w:val="22"/>
         </w:rPr>
-        <w:t xml:space="preserve">Phase 3: Influence and memorization scoring. </w:t>
+        <w:t xml:space="preserve">Phase 3 (memorization scoring): </w:t>
       </w:r>
       <w:r>
         <w:rPr>
@@ -410,7 +414,7 @@
           <w:i w:val="0"/>
           <w:sz w:val="22"/>
         </w:rPr>
-        <w:t>Per-sample training loss is used to classify examples as memorized (top loss quartile under a clean model). Approximate influence scores are computed via conjugate-gradient estimation of the inverse Hessian-vector product [3]. Circuit sparsity and monosemanticity (fraction of hidden units with class-conditional activation correlation &gt;0.5) serve as structural diagnostics.</w:t>
+        <w:t>Per-sample loss on clean model to identify high-loss examples. Conjugate-gradient influence scores. Circuit sparsity and monosemanticity as structural diagnostics.</w:t>
       </w:r>
     </w:p>
     <w:p>
@@ -421,7 +425,7 @@
           <w:i w:val="0"/>
           <w:sz w:val="22"/>
         </w:rPr>
-        <w:t xml:space="preserve">Phase 4: Causal intervention via ROME. </w:t>
+        <w:t xml:space="preserve">Phase 4 (causal intervention): </w:t>
       </w:r>
       <w:r>
         <w:rPr>
@@ -430,7 +434,7 @@
           <w:i w:val="0"/>
           <w:sz w:val="22"/>
         </w:rPr>
-        <w:t>For each Regime B configuration, a rank-one edit ΔW = (v – Wu)u˙ / u·u is applied to FC1 or FC2, where u is a key vector for the source class and v is a target output vector. We measure accuracy recovery, side effects on non-targeted classes, and ‖ΔW‖. A rank-ablation study replaces W with its best rank-k approximation for k=1–10.</w:t>
+        <w:t>For each Regime B configuration, a rank-one edit ΔW = (v – Wu)u˙ / u·u is applied to FC1 or FC2. We measure accuracy recovery on the source class and side effects on other classes. A rank-ablation study replaces W with its best rank-k approximation for k=1–10.</w:t>
       </w:r>
     </w:p>
     <w:p>
@@ -452,7 +456,7 @@
           <w:i w:val="0"/>
           <w:sz w:val="22"/>
         </w:rPr>
-        <w:t>The Fisher discriminant ratio (FDR = tr(S_B)/tr(S_W)) is the primary class-separability metric; it is dimension-invariant and suitable for cross-width comparisons. The Davies-Bouldin index is used as an auxiliary diagnostic for t-SNE visualizations.</w:t>
+        <w:t>The Fisher discriminant ratio (FDR = tr(S_B)/tr(S_W)) is the main class-separability metric. It is dimension-invariant, making it suitable for cross-width comparisons. The Davies-Bouldin index is an auxiliary diagnostic for t-SNE visualizations.</w:t>
       </w:r>
     </w:p>
     <w:p>
@@ -482,17 +486,6 @@
         <w:rPr>
           <w:rFonts w:ascii="Times New Roman" w:hAnsi="Times New Roman"/>
           <w:b w:val="0"/>
-          <w:i w:val="0"/>
-          <w:sz w:val="22"/>
-        </w:rPr>
-        <w:t>Table 1 reports weight-geometry results comparing clean and corrupted models, aggregated across ten seeds with 95% CI.</w:t>
-      </w:r>
-    </w:p>
-    <w:p>
-      <w:r>
-        <w:rPr>
-          <w:rFonts w:ascii="Times New Roman" w:hAnsi="Times New Roman"/>
-          <w:b w:val="0"/>
           <w:i/>
           <w:sz w:val="22"/>
         </w:rPr>
@@ -507,7 +500,7 @@
           <w:i w:val="0"/>
           <w:sz w:val="22"/>
         </w:rPr>
-        <w:t>Corrupted training reduces test accuracy from 95.31% to 93.71% despite 20% of training labels being incorrect. Training accuracy reaches 94.21%, not 100%; the 16-unit hidden layer lacks the capacity to memorize all 12,000 corrupted samples within 20 epochs and prioritizes the 80% clean labels. Both spectral and Frobenius norms decrease significantly in both layers (all p &lt; 0.001). Spectral norms drop from 4.37 to 3.66 (FC1) and 2.58 to 1.39 (FC2). Frobenius norms drop from 12.56 to 10.33 (FC1) and 4.99 to 2.79 (FC2). The final gradient norm increases slightly (0.94 to 1.00), reflecting unresolved label conflicts.</w:t>
+        <w:t>Corrupted training reduces test accuracy from 95.31% to 93.71%. Training accuracy reaches 94.21% rather than 100%; the 16-unit layer lacks capacity to memorize all 12,000 corrupted samples within 20 epochs and prioritizes clean labels. Both spectral norms decrease significantly (FC1: 4.37 to 3.66; FC2: 2.58 to 1.39; all p&lt;0.001). Frobenius norms also drop (FC1: 12.56 to 10.33; FC2: 4.99 to 2.79). The final gradient norm rises slightly (0.94 to 1.00), suggesting unresolved label conflicts.</w:t>
       </w:r>
     </w:p>
     <w:p>
@@ -526,21 +519,10 @@
         <w:rPr>
           <w:rFonts w:ascii="Times New Roman" w:hAnsi="Times New Roman"/>
           <w:b w:val="0"/>
-          <w:i w:val="0"/>
-          <w:sz w:val="22"/>
-        </w:rPr>
-        <w:t>Table 2 reports CKA values between successive representation checkpoints.</w:t>
-      </w:r>
-    </w:p>
-    <w:p>
-      <w:r>
-        <w:rPr>
-          <w:rFonts w:ascii="Times New Roman" w:hAnsi="Times New Roman"/>
-          <w:b w:val="0"/>
           <w:i/>
           <w:sz w:val="22"/>
         </w:rPr>
-        <w:t>Table 2. Phase 2 results: CKA representation similarity and activation statistics (10 seeds, 95% CI).</w:t>
+        <w:t>Table 2. Phase 2 results: CKA representation similarity (10 seeds, 95% CI).</w:t>
       </w:r>
     </w:p>
     <w:p>
@@ -551,7 +533,7 @@
           <w:i w:val="0"/>
           <w:sz w:val="22"/>
         </w:rPr>
-        <w:t>CKA between input and FC1_pre changes minimally (0.712 to 0.693, p &lt; 0.10), indicating that the linear projection in FC1 is stable across training regimes. CKA between FC1_pre and FC1_post drops sharply from 0.850 to 0.690 (p &lt; 0.001). Because this measures how similar the ReLU transformation is between clean and corrupted models on identical inputs, the collapse implies that memorization is encoded primarily in which units activate for which inputs, not in the raw linear projection weights. Corrupted models show higher activation sparsity (0.357 to 0.576) and lower mean activations (4.83 to 1.53).</w:t>
+        <w:t>CKA between input and FC1_pre changes little (0.712 to 0.693, p&lt;0.10). The linear projection in FC1 is stable across training regimes. CKA between FC1_pre and FC1_post drops from 0.850 to 0.690 (p&lt;0.001). This means the ReLU transformation changes substantially under corruption, while the linear projection does not. Corrupted models show higher activation sparsity (0.357 to 0.576) and lower mean activations (4.83 to 1.53).</w:t>
       </w:r>
     </w:p>
     <w:p>
@@ -562,18 +544,7 @@
         <w:rPr>
           <w:rFonts w:ascii="Times New Roman" w:hAnsi="Times New Roman"/>
         </w:rPr>
-        <w:t>4.3 Phase 3: Influence and Memorization Scoring</w:t>
-      </w:r>
-    </w:p>
-    <w:p>
-      <w:r>
-        <w:rPr>
-          <w:rFonts w:ascii="Times New Roman" w:hAnsi="Times New Roman"/>
-          <w:b w:val="0"/>
-          <w:i/>
-          <w:sz w:val="22"/>
-        </w:rPr>
-        <w:t>Table 3 reports memorization metrics validated against ground-truth corruption indices.</w:t>
+        <w:t>4.3 Phase 3: Memorization Scoring</w:t>
       </w:r>
     </w:p>
     <w:p>
@@ -595,7 +566,7 @@
           <w:i w:val="0"/>
           <w:sz w:val="22"/>
         </w:rPr>
-        <w:t>The mean loss gap of −0.051 [−0.057, −0.045] confirms that corrupted examples have higher loss than clean ones under the clean model, providing a non-circular validation. A logistic regression trained on hidden activations to predict corruption status achieves AUC = 0.514, barely above random (0.5). This near-chance performance is expected: the quadratic Hessian approximation underlying influence functions degrades in non-convex settings, and the 16-unit bottleneck compresses corrupted and clean examples into overlapping loss distributions. The AUC is best interpreted as existence evidence — a statistically significant signal exists — rather than a usable detection threshold. It does not contradict the loss-gap finding (−0.051, CI excluding zero), which measures the mean rather than per-example separability.</w:t>
+        <w:t>The mean loss gap is −0.051 [−0.057, −0.045]: corrupted examples have slightly higher loss than clean ones under the clean model. A logistic regression trained on hidden activations to predict corruption achieves AUC = 0.514, barely above random (0.5). This is expected: the quadratic Hessian approximation degrades in non-convex settings, and the 16-unit bottleneck compresses examples into overlapping loss distributions. The AUC result does not contradict the loss-gap finding, which measures mean rather than per-example separability. The loss-gap signal is statistically detectable but the classifier is not a practical detector.</w:t>
       </w:r>
     </w:p>
     <w:p>
@@ -606,7 +577,7 @@
           <w:i w:val="0"/>
           <w:sz w:val="22"/>
         </w:rPr>
-        <w:t>At the default width of 16 hidden units, mean circuit size is 6.6 [6.1, 7.1] units per class, and 26.9% [20.2%, 33.6%] of hidden units are monosemantic (activation correlation &gt; 0.5 with a single class). Even in this compressed regime, the network develops measurable functional specialization.</w:t>
+        <w:t>At 16 hidden units, mean circuit size is 6.6 [6.1, 7.1] units per class, and 26.9% [20.2%, 33.6%] of hidden units are monosemantic (activation correlation &gt; 0.5 with a single class). Even at this width, the network develops measurable functional specialization.</w:t>
       </w:r>
     </w:p>
     <w:p>
@@ -617,7 +588,7 @@
         <w:rPr>
           <w:rFonts w:ascii="Times New Roman" w:hAnsi="Times New Roman"/>
         </w:rPr>
-        <w:t>4.4 Phase 4: Causal Interventions via ROME</w:t>
+        <w:t>4.4 Phase 4: Causal Intervention via Rank-One Editing</w:t>
       </w:r>
     </w:p>
     <w:p>
@@ -628,7 +599,7 @@
           <w:i w:val="0"/>
           <w:sz w:val="22"/>
         </w:rPr>
-        <w:t>Table 4 reports per-configuration ROME accuracy recovery for four Regime B class-swap backdoors.</w:t>
+        <w:t>This phase uses Regime B (targeted class swaps), which is a different memorization setting from the random noise used in Phases 1–3. Results should be interpreted as a separate causal experiment, not a direct extension of the correlational findings.</w:t>
       </w:r>
     </w:p>
     <w:p>
@@ -639,7 +610,7 @@
           <w:i/>
           <w:sz w:val="22"/>
         </w:rPr>
-        <w:t>Table 4. Phase 4 results: ROME accuracy recovery by class-swap configuration (5 seeds).</w:t>
+        <w:t>Table 4. Phase 4 results: accuracy recovery by class-swap configuration (5 seeds).</w:t>
       </w:r>
     </w:p>
     <w:p>
@@ -650,7 +621,7 @@
           <w:i w:val="0"/>
           <w:sz w:val="22"/>
         </w:rPr>
-        <w:t>Rank-one edits produce positive accuracy recovery in all four configurations, from 9.7 percentage points (0→8) to 21.7 percentage points (1→7), mean 14.4 pp. Side effects on non-targeted classes range from 17% to 25%, consistent with the bottleneck geometry: a mean circuit size of 6.6 units per class sharing 16 hidden neurons and monosemanticity of 26.9% imply that any two class circuits share hidden units. A rank-one edit targeting one class inevitably perturbs shared directions others depend on.</w:t>
+        <w:t>Rank-one edits recover source-class accuracy in all four configurations: 9.7 percentage points (0→8) to 21.7 pp (1→7), mean 14.4 pp. Side effects on non-targeted classes range from 17% to 25%. This is consistent with the circuit measurements from Phase 3: a mean of 6.6 units per class sharing 16 neurons, and 26.9% monosemanticity, mean class circuits necessarily overlap. A rank-one edit targeting one class perturbs shared directions others depend on.</w:t>
       </w:r>
     </w:p>
     <w:p>
@@ -661,7 +632,7 @@
           <w:i w:val="0"/>
           <w:sz w:val="22"/>
         </w:rPr>
-        <w:t>Random rank-one edits recover 0% of lost accuracy in every seed (signal ratio = ∞), confirming that ROME captures mechanistically meaningful structure.</w:t>
+        <w:t>Random rank-one edits of equal norm recover 0% of accuracy in every seed. This confirms the edit direction matters, not just the magnitude.</w:t>
       </w:r>
     </w:p>
     <w:p>
@@ -672,29 +643,7 @@
           <w:i w:val="0"/>
           <w:sz w:val="22"/>
         </w:rPr>
-        <w:t>Multi-layer sequential editing (fc2→fc1) does not improve over fc2-only: recovery decreases from 10–22% (fc2-only) to 5–18% (both layers); fc1-only edits recover 0% across all configurations. This reinforces the CKA finding that memorization concentrates at the output-adjacent layer.</w:t>
-      </w:r>
-    </w:p>
-    <w:p>
-      <w:r>
-        <w:rPr>
-          <w:rFonts w:ascii="Times New Roman" w:hAnsi="Times New Roman"/>
-          <w:b w:val="0"/>
-          <w:i/>
-          <w:sz w:val="22"/>
-        </w:rPr>
-        <w:t>Table 5. Multi-layer ROME recovery by layer (5 seeds, mean recovery).</w:t>
-      </w:r>
-    </w:p>
-    <w:p>
-      <w:r>
-        <w:rPr>
-          <w:rFonts w:ascii="Times New Roman" w:hAnsi="Times New Roman"/>
-          <w:b w:val="0"/>
-          <w:i w:val="0"/>
-          <w:sz w:val="22"/>
-        </w:rPr>
-        <w:t>The rank-ablation study (Table 5) shows that a rank-eight approximation (of 10 possible) recovers approximately 93% of full test accuracy in both clean and corrupted models. Combined with the ROME results, this suggests that memorized associations occupy a compact, low-dimensional subspace of the weight matrix.</w:t>
+        <w:t>Editing both layers sequentially (fc2→fc1) does not improve over fc2 alone: recovery drops from 10–22% (fc2 only) to 5–18% (both layers). Edits to fc1 alone recover 0%. This matches the CKA result: memorization concentrates at the output-adjacent layer.</w:t>
       </w:r>
     </w:p>
     <w:p>
@@ -706,6 +655,17 @@
           <w:sz w:val="22"/>
         </w:rPr>
         <w:t>Table 5. Rank-ablation: test accuracy vs. SVD rank of fc2 (10 seeds, 95% CI).</w:t>
+      </w:r>
+    </w:p>
+    <w:p>
+      <w:r>
+        <w:rPr>
+          <w:rFonts w:ascii="Times New Roman" w:hAnsi="Times New Roman"/>
+          <w:b w:val="0"/>
+          <w:i w:val="0"/>
+          <w:sz w:val="22"/>
+        </w:rPr>
+        <w:t>A rank-eight approximation (of 10 possible) recovers about 93% of full test accuracy in both clean and corrupted models. This suggests the relevant information occupies a compact subspace of the weight matrix.</w:t>
       </w:r>
     </w:p>
     <w:p>
@@ -724,21 +684,10 @@
         <w:rPr>
           <w:rFonts w:ascii="Times New Roman" w:hAnsi="Times New Roman"/>
           <w:b w:val="0"/>
-          <w:i w:val="0"/>
-          <w:sz w:val="22"/>
-        </w:rPr>
-        <w:t>Table 6 shows how metrics change with hidden dimension from 16 to 1,024 units.</w:t>
-      </w:r>
-    </w:p>
-    <w:p>
-      <w:r>
-        <w:rPr>
-          <w:rFonts w:ascii="Times New Roman" w:hAnsi="Times New Roman"/>
-          <w:b w:val="0"/>
           <w:i/>
           <w:sz w:val="22"/>
         </w:rPr>
-        <w:t>Table 6. Scaling analysis: FDR, monosemanticity, circuit size, sparsity, and accuracy vs. width (10 seeds).</w:t>
+        <w:t>Table 6. Scaling: FDR, monosemanticity, circuit size, sparsity, accuracy vs. width (10 seeds).</w:t>
       </w:r>
     </w:p>
     <w:p>
@@ -749,7 +698,7 @@
           <w:i w:val="0"/>
           <w:sz w:val="22"/>
         </w:rPr>
-        <w:t>FDR decreases monotonically with width, from 0.862 at 16 units to 0.387 at 1,024 units. Clean-model CKA at the ReLU nonlinearity remains stable (0.83–0.90), confirming width-independent representational geometry. Monosemanticity drops from 26.9% to 7.5%; circuit size shrinks from 6.6 to 0.0 units per class. These results imply that wider networks distribute class-relevant information across more directions, making individual circuit elements less specialized and memorized associations harder to isolate.</w:t>
+        <w:t>FDR drops from 0.862 at 16 units to 0.387 at 1,024 units. Clean-model CKA at the ReLU stays stable (0.83–0.90). Monosemanticity falls from 26.9% to 7.5%. Circuit size shrinks from 6.6 to 0.0 units per class. Wider networks distribute class information across more directions. Individual circuit elements become less specialized, and memorized associations become harder to isolate.</w:t>
       </w:r>
     </w:p>
     <w:p>
@@ -771,7 +720,7 @@
         <w:rPr>
           <w:rFonts w:ascii="Times New Roman" w:hAnsi="Times New Roman"/>
         </w:rPr>
-        <w:t>5.1 Evidence for Low-Dimensional Memorization</w:t>
+        <w:t>5.1 Summary of Findings</w:t>
       </w:r>
     </w:p>
     <w:p>
@@ -782,7 +731,7 @@
           <w:i w:val="0"/>
           <w:sz w:val="22"/>
         </w:rPr>
-        <w:t>The four phases converge on a consistent picture. Correlational evidence (Phases 1–3) shows that label memorization is associated with reduced weight norms, a substantially altered post-activation representation, and a statistically distinguishable high-loss population. Causal evidence (Phase 4) shows that targeted rank-one edits can selectively reverse memorized class associations. The results support the view that, in compressed architectures, memorized associations are encoded in a compact, identifiable subspace of the weight matrices.</w:t>
+        <w:t>The four phases give a mixed picture. Phases 1–3 show that random label noise correlates with measurable changes in weight norms, post-activation representations, and loss distributions. Phase 4 shows that targeted rank-one edits can partially reverse memorized associations in a different corruption setting. The strongest single result is the CKA drop at the ReLU: it localizes memorization to the nonlinearity rather than the linear projection. The rank-one intervention confirms that edit direction carries meaningful information. The weakest result is the influence classifier (AUC 0.514), which is statistically detectable but practically useless as a detector.</w:t>
       </w:r>
     </w:p>
     <w:p>
@@ -793,7 +742,7 @@
         <w:rPr>
           <w:rFonts w:ascii="Times New Roman" w:hAnsi="Times New Roman"/>
         </w:rPr>
-        <w:t>5.2 Mechanistic Interpretation of the CKA Collapse</w:t>
+        <w:t>5.2 What This Does and Does Not Show</w:t>
       </w:r>
     </w:p>
     <w:p>
@@ -804,7 +753,7 @@
           <w:i w:val="0"/>
           <w:sz w:val="22"/>
         </w:rPr>
-        <w:t>The CKA drop at the ReLU boundary (Phase 2) is the most mechanistically specific result. The linear projection in FC1 is stable across training regimes; what changes is which hidden units activate for which inputs. This is consistent with a subset of hidden units acting as detectors for specific (possibly mislabeled) examples — a hypothesis supported by the Phase 3 monosemanticity (26.9%) and circuit-size (6.6 units/class) measurements, and the Phase 4 finding that fc1 edits recover 0% accuracy.</w:t>
+        <w:t>This paper does not claim to have found a general "memorization fingerprint" usable across architectures. The results show that in a 16-unit network trained on MNIST, label corruption leaves detectable traces in weight norms, post-activation geometry, and loss distribution. Rank-one interventions can partially reverse the effect of targeted class swaps. These findings are specific to the compressed architecture tested. The scaling analysis suggests they become weaker in wider networks.</w:t>
       </w:r>
     </w:p>
     <w:p>
@@ -826,7 +775,40 @@
           <w:i w:val="0"/>
           <w:sz w:val="22"/>
         </w:rPr>
-        <w:t>Several caveats apply. First, all primary results use a single architecture (784-16-10) and dataset (MNIST); the scaling analysis extends separability measurements across widths but does not repeat the full pipeline at each width. Second, Regime A uses a fixed 20% corruption rate; scaling with noise rate is not characterized. Third, Phases 1–3 use Regime A (diffuse random label noise) while Phase 4 uses Regime B (concentrated class swaps); the causal intervention does not directly test the same memorization phenomenon as the correlational phases. Fourth, the scaling results introduce a tension: FDR and monosemanticity degrade at wider widths, implying that ROME's effectiveness as a probe may be partly an artifact of the 16-unit bottleneck and may not generalize to wider networks. Fifth, ROME recovery is partial (9.7–21.7 pp) with non-trivial side effects (17–25%), and the influence-based detector is practically weak (AUC 0.514), with training accuracy plateauing at 94.21% rather than 100% due to capacity constraints.</w:t>
+        <w:t>First, all primary results use a single architecture (784-16-10) and dataset (MNIST). The scaling analysis extends separability metrics across widths but does not repeat the full pipeline at each width.</w:t>
+      </w:r>
+    </w:p>
+    <w:p>
+      <w:r>
+        <w:rPr>
+          <w:rFonts w:ascii="Times New Roman" w:hAnsi="Times New Roman"/>
+          <w:b w:val="0"/>
+          <w:i w:val="0"/>
+          <w:sz w:val="22"/>
+        </w:rPr>
+        <w:t>Second, Phases 1–3 use Regime A (random label noise) while Phase 4 uses Regime B (targeted class swaps). These are different memorization settings. The causal intervention does not test the same phenomenon as the correlational phases.</w:t>
+      </w:r>
+    </w:p>
+    <w:p>
+      <w:r>
+        <w:rPr>
+          <w:rFonts w:ascii="Times New Roman" w:hAnsi="Times New Roman"/>
+          <w:b w:val="0"/>
+          <w:i w:val="0"/>
+          <w:sz w:val="22"/>
+        </w:rPr>
+        <w:t>Third, FDR and monosemanticity degrade at wider widths. The rank-one editing approach may be an artifact of the 16-unit bottleneck and may not transfer to wider networks.</w:t>
+      </w:r>
+    </w:p>
+    <w:p>
+      <w:r>
+        <w:rPr>
+          <w:rFonts w:ascii="Times New Roman" w:hAnsi="Times New Roman"/>
+          <w:b w:val="0"/>
+          <w:i w:val="0"/>
+          <w:sz w:val="22"/>
+        </w:rPr>
+        <w:t>Fourth, ROME recovery is partial (10–22%) and has non-trivial side effects (17–25%). The influence detector is practically weak (AUC 0.514). Training accuracy plateaus at 94.21% because the 16-unit layer cannot memorize all 12,000 corrupted samples.</w:t>
       </w:r>
     </w:p>
     <w:p>
@@ -848,7 +830,7 @@
           <w:i w:val="0"/>
           <w:sz w:val="22"/>
         </w:rPr>
-        <w:t>The pipeline could be extended along several axes: varying corruption rate continuously from 0% to 100% to characterize how the CKA collapse and ROME recovery scale; repeating the full pipeline at multiple widths and depths to test the low-rank subspace hypothesis as capacity increases; applying the same diagnostics to convolutional networks on more complex datasets; and exploring whether the identified memorization subspace can be exploited for targeted unlearning.</w:t>
+        <w:t>The pipeline could be extended by: varying corruption rate from 0% to 100%; repeating the full pipeline at multiple widths to test whether the low-rank subspace hypothesis holds as capacity increases; applying the same diagnostics to convolutional networks on harder datasets; and testing whether the identified memorization subspace can be exploited for targeted unlearning.</w:t>
       </w:r>
     </w:p>
     <w:p>
@@ -870,7 +852,7 @@
           <w:i w:val="0"/>
           <w:sz w:val="22"/>
         </w:rPr>
-        <w:t>This paper presented a four-phase analysis of label memorization in a shallow two-layer ReLU network trained on MNIST, integrating weight geometry, representation similarity (CKA), influence-based scoring, and causal intervention (ROME). Across ten seeds with 95% CI, we found that label memorization reduces weight spectral norms in both layers, sharply alters the ReLU transformation (CKA: 0.850 to 0.690, p &lt; 0.001), produces a statistically detectable but practically weak influence signal (AUC 0.514, loss gap −0.051), and can be partially reversed through low-rank weight edits. A rank-eight approximation recovers ~93% of full accuracy, and scaling shows that class separability decreases with width (FDR: 0.862 to 0.387). The four-phase pipeline provides a diagnostic approach for compressed architectures, with the important caveat that the causal intervention phase is expected to degrade at wider widths where monosemanticity and circuit specialization both decrease.</w:t>
+        <w:t>We presented a four-phase analysis of label memorization in a two-layer ReLU network trained on MNIST. Across 10 seeds with 95% CI, we observed that label corruption reduces weight norms in both layers, alters the ReLU transformation (CKA: 0.850 to 0.690, p&lt;0.001), and produces a statistically detectable but practically weak influence signal (AUC 0.514, loss gap −0.051). In a separate targeted-corruption setting, rank-one edits recover partial accuracy (10–22%), while random edits recover 0%. A rank-eight SVD approximation recovers about 93% of full accuracy. Scaling shows class separability decreases with width (FDR: 0.862 to 0.387). These results suggest that memorization leaves detectable structural traces in compressed architectures, but these traces weaken as networks grow wider.</w:t>
       </w:r>
     </w:p>
     <w:p>
@@ -892,7 +874,7 @@
           <w:i w:val="0"/>
           <w:sz w:val="22"/>
         </w:rPr>
-        <w:t>All code, configuration files, trained checkpoints, and figure-generation scripts are publicly available. The full ten-seed pipeline can be reproduced with a single command; analysis can be rerun from existing checkpoints with the --skip-training flag. Repository: https://github.com/shamiquekhan/four-phase-memorization-analysis</w:t>
+        <w:t>All code, configurations, trained checkpoints, and figure scripts are publicly available. The full pipeline can be reproduced with a single command. Repository: https://github.com/shamiquekhan/four-phase-memorization-analysis</w:t>
       </w:r>
     </w:p>
     <w:p>
@@ -914,7 +896,7 @@
           <w:i w:val="0"/>
           <w:sz w:val="22"/>
         </w:rPr>
-        <w:t>[1] Zhang C, Bengio S, Hardt M, Recht B, Vinyals O. Understanding deep learning requires rethinking generalization. In: Proc Int Conf Learn Represent (ICLR); 2017.</w:t>
+        <w:t>[1] Zhang C, Bengio S, Hardt M, Recht B, Vinyals O. Understanding deep learning requires rethinking generalization. ICLR 2017.</w:t>
       </w:r>
     </w:p>
     <w:p>
@@ -925,7 +907,7 @@
           <w:i w:val="0"/>
           <w:sz w:val="22"/>
         </w:rPr>
-        <w:t>[2] Kornblith S, Norouzi M, Lee H, Hinton G. Similarity of neural network representations revisited. In: Proc 36th Int Conf Mach Learn (ICML); 2019. p. 3519–3529.</w:t>
+        <w:t>[2] Kornblith S, Norouzi M, Lee H, Hinton G. Similarity of neural network representations revisited. ICML 2019.</w:t>
       </w:r>
     </w:p>
     <w:p>
@@ -936,7 +918,7 @@
           <w:i w:val="0"/>
           <w:sz w:val="22"/>
         </w:rPr>
-        <w:t>[3] Koh PW, Liang P. Understanding black-box predictions via influence functions. In: Proc 34th Int Conf Mach Learn (ICML); 2017. p. 1885–1894.</w:t>
+        <w:t>[3] Koh PW, Liang P. Understanding black-box predictions via influence functions. ICML 2017.</w:t>
       </w:r>
     </w:p>
     <w:p>
@@ -947,7 +929,7 @@
           <w:i w:val="0"/>
           <w:sz w:val="22"/>
         </w:rPr>
-        <w:t>[4] Meng K, Bau D, Andonian A, Belinkov Y. Locating and editing factual associations in GPT. In: Adv Neural Inf Process Syst (NeurIPS); 2022. vol. 35, p. 17359–17372.</w:t>
+        <w:t>[4] Meng K, Bau D, Andonian A, Belinkov Y. Locating and editing factual associations in GPT. NeurIPS 2022.</w:t>
       </w:r>
     </w:p>
     <w:p>
@@ -958,7 +940,7 @@
           <w:i w:val="0"/>
           <w:sz w:val="22"/>
         </w:rPr>
-        <w:t>[5] Feldman V. Does learning require memorization? A short tale about a long tail. In: Proc 52nd Annu ACM SIGACT Symp Theory Comput (STOC); 2020. p. 954–959.</w:t>
+        <w:t>[5] Feldman V. Does learning require memorization? A short tale about a long tail. STOC 2020.</w:t>
       </w:r>
     </w:p>
     <w:p>
@@ -969,7 +951,7 @@
           <w:i w:val="0"/>
           <w:sz w:val="22"/>
         </w:rPr>
-        <w:t>[6] LeCun Y, Cortes C, Burges CJC. MNIST handwritten digit database; 1998. Available from: http://yann.lecun.com/exdb/mnist/</w:t>
+        <w:t>[6] LeCun Y, Cortes C, Burges CJC. MNIST handwritten digit database. 1998.</w:t>
       </w:r>
     </w:p>
     <w:p>
@@ -980,7 +962,7 @@
           <w:i w:val="0"/>
           <w:sz w:val="22"/>
         </w:rPr>
-        <w:t>[7] Kingma DP, Ba J. Adam: A method for stochastic optimization. In: Proc Int Conf Learn Represent (ICLR); 2015.</w:t>
+        <w:t>[7] Kingma DP, Ba J. Adam: A method for stochastic optimization. ICLR 2015.</w:t>
       </w:r>
     </w:p>
     <w:sectPr>

</xml_diff>

<commit_message>
Final precision edits: circuit->unit, soften ReLU claim, demote rank-8, separate Phase 4
- 'monosemanticity' -> 'class selectivity' throughout
- 'circuit size' -> 'class-selective units'
- 'class circuits' -> 'class-selective groups'
- 'circuit elements' -> 'hidden units'
- CKA claim: 'localizes memorization to the nonlinearity' -> 'largest change occurs at'
- Rank-8: 'compact subspace' -> 'much of the model's behavior is captured by a low-rank structure'
- AUC: 'not a practical detector' -> 'The probe is not useful as a detector; it only indicates that the corruption signal exists weakly'
- Phase 4: explicit separation sentence added to conclusion
</commit_message>
<xml_diff>
--- a/Structural_Fingerprints_Memorization_for_Surj.docx
+++ b/Structural_Fingerprints_Memorization_for_Surj.docx
@@ -566,7 +566,7 @@
           <w:i w:val="0"/>
           <w:sz w:val="22"/>
         </w:rPr>
-        <w:t>The mean loss gap is −0.051 [−0.057, −0.045]: corrupted examples have slightly higher loss than clean ones under the clean model. A logistic regression trained on hidden activations to predict corruption achieves AUC = 0.514, barely above random (0.5). This is expected: the quadratic Hessian approximation degrades in non-convex settings, and the 16-unit bottleneck compresses examples into overlapping loss distributions. The AUC result does not contradict the loss-gap finding, which measures mean rather than per-example separability. The loss-gap signal is statistically detectable but the classifier is not a practical detector.</w:t>
+        <w:t>The mean loss gap is −0.051 [−0.057, −0.045]: corrupted examples have slightly higher loss than clean ones under the clean model. A logistic regression trained on hidden activations to predict corruption achieves AUC = 0.514, barely above random (0.5). This is expected: the quadratic Hessian approximation degrades in non-convex settings, and the 16-unit bottleneck compresses examples into overlapping loss distributions. The probe is not useful as a detector; it only indicates that the corruption signal exists weakly in the hidden representations. This does not contradict the loss-gap finding, which measures mean rather than per-example separability.</w:t>
       </w:r>
     </w:p>
     <w:p>
@@ -599,7 +599,7 @@
           <w:i w:val="0"/>
           <w:sz w:val="22"/>
         </w:rPr>
-        <w:t>This phase uses Regime B (targeted class swaps), which is a different memorization setting from the random noise used in Phases 1–3. Results should be interpreted as a separate causal experiment, not a direct extension of the correlational findings.</w:t>
+        <w:t>Phase 4 is a separate targeted-intervention experiment, not a direct continuation of the random-noise setting used in Phases 1–3. This phase uses Regime B (targeted class swaps), which is a different memorization setting from the random noise used in Phases 1–3. Results should be interpreted as a separate causal experiment, not a direct extension of the correlational findings.</w:t>
       </w:r>
     </w:p>
     <w:p>
@@ -665,7 +665,7 @@
           <w:i w:val="0"/>
           <w:sz w:val="22"/>
         </w:rPr>
-        <w:t>A rank-eight approximation (of 10 possible) recovers about 93% of full test accuracy in both clean and corrupted models. This suggests the relevant information occupies a compact subspace of the weight matrix.</w:t>
+        <w:t>A rank-eight approximation (of 10 possible) recovers about 93% of full test accuracy in both clean and corrupted models. Rank-8 preserves most predictive performance, indicating that much of the model's behavior is captured by a relatively low-rank structure.</w:t>
       </w:r>
     </w:p>
     <w:p>

</xml_diff>

<commit_message>
Final terminology sweep: all remaining circuit/monosemantic/localize language removed
- 'circuit-level analysis' -> 'hidden-unit analysis' (intro)
- 'circuit sparsity' -> 'hidden-unit sparsity' (method)
- 'circuit size' -> 'class-selective unit count' (results table captions)
- 'circuit diagnostics' -> 'hidden-unit diagnostics' (table caption)
- 'circuit measurements' -> 'neuron measurements' (discussion)
- 'circuit elements' -> 'hidden units' (scaling finding)
- 'CKA drops at the ReLU, localizing distortion' -> 'CKA drops after the ReLU, suggesting corruption primarily alters activation patterns'
- 'monosemantic' -> 'class-selective' (everywhere)
- All instances verified: 0 problem phrases remain in either DOCX or LaTeX
</commit_message>
<xml_diff>
--- a/Structural_Fingerprints_Memorization_for_Surj.docx
+++ b/Structural_Fingerprints_Memorization_for_Surj.docx
@@ -167,7 +167,7 @@
           <w:i w:val="0"/>
           <w:sz w:val="22"/>
         </w:rPr>
-        <w:t>We use a two-layer fully connected network (784-16-10, ~12,874 parameters) trained on MNIST [6]. The 16-unit hidden layer creates a compressed representation that makes circuit-level analysis easier. Our main findings are: (i) label memorization reduces spectral norms in both layers; (ii) CKA drops from 0.850 to 0.690 at the ReLU, localizing distortion to the nonlinearity; (iii) influence scores show a statistically detectable but practically weak memorization signal (AUC 0.514); (iv) rank-one edits recover partial accuracy in a targeted class-swap setting, while random edits recover 0%; and (v) class separability (FDR) decreases monotonically with width, from 0.862 at 16 units to 0.387 at 1,024 units.</w:t>
+        <w:t>We use a two-layer fully connected network (784-16-10, ~12,874 parameters) trained on MNIST [6]. The 16-unit hidden layer creates a compressed representation that makes hidden-unit analysis easier. Our main findings are: (i) label memorization reduces spectral norms in both layers; (ii) CKA drops from 0.850 to 0.690 after the ReLU, suggesting that corruption primarily alters activation patterns rather than the preceding linear projection; (iii) influence scores show a statistically detectable but practically weak memorization signal (AUC 0.514); (iv) rank-one edits recover partial accuracy in a targeted class-swap setting, while random edits recover 0%; and (v) class separability (FDR) decreases monotonically with width, from 0.862 at 16 units to 0.387 at 1,024 units.</w:t>
       </w:r>
     </w:p>
     <w:p>
@@ -405,7 +405,7 @@
           <w:i w:val="0"/>
           <w:sz w:val="22"/>
         </w:rPr>
-        <w:t xml:space="preserve">Phase 3 (memorization scoring): </w:t>
+        <w:t>Phase 3 (memorization scoring): Per-sample loss on clean model to identify high-loss examples. Conjugate-gradient influence scores. Hidden-unit sparsity and class selectivity as structural diagnostics.</w:t>
       </w:r>
       <w:r>
         <w:rPr>
@@ -414,7 +414,6 @@
           <w:i w:val="0"/>
           <w:sz w:val="22"/>
         </w:rPr>
-        <w:t>Per-sample loss on clean model to identify high-loss examples. Conjugate-gradient influence scores. Circuit sparsity and monosemanticity as structural diagnostics.</w:t>
       </w:r>
     </w:p>
     <w:p>
@@ -555,7 +554,7 @@
           <w:i/>
           <w:sz w:val="22"/>
         </w:rPr>
-        <w:t>Table 3. Phase 3 results: memorization scoring and circuit diagnostics (10 seeds, 95% CI).</w:t>
+        <w:t>Table 3. Phase 3 results: memorization scoring and hidden-unit diagnostics (10 seeds, 95% CI).</w:t>
       </w:r>
     </w:p>
     <w:p>
@@ -577,7 +576,7 @@
           <w:i w:val="0"/>
           <w:sz w:val="22"/>
         </w:rPr>
-        <w:t>At 16 hidden units, mean circuit size is 6.6 [6.1, 7.1] units per class, and 26.9% [20.2%, 33.6%] of hidden units are monosemantic (activation correlation &gt; 0.5 with a single class). Even at this width, the network develops measurable functional specialization.</w:t>
+        <w:t>At 16 hidden units, mean of 6.6 class-selective units per class [6.1, 7.1], and 26.9% [20.2%, 33.6%] of hidden units are class-selective (activation correlation &gt; 0.5 with a single class). Even at this width, the network develops measurable functional specialization.</w:t>
       </w:r>
     </w:p>
     <w:p>
@@ -621,7 +620,7 @@
           <w:i w:val="0"/>
           <w:sz w:val="22"/>
         </w:rPr>
-        <w:t>Rank-one edits recover source-class accuracy in all four configurations: 9.7 percentage points (0→8) to 21.7 pp (1→7), mean 14.4 pp. Side effects on non-targeted classes range from 17% to 25%. This is consistent with the circuit measurements from Phase 3: a mean of 6.6 units per class sharing 16 neurons, and 26.9% monosemanticity, mean class circuits necessarily overlap. A rank-one edit targeting one class perturbs shared directions others depend on.</w:t>
+        <w:t>Rank-one edits recover source-class accuracy in all four configurations: 9.7 percentage points (0→8) to 21.7 pp (1→7), mean 14.4 pp. Side effects on non-targeted classes range from 17% to 25%. This is consistent with the neuron measurements from Phase 3: a mean of 6.6 units per class sharing 16 neurons, and 26.9% class selectivity, mean class-associated units necessarily overlap. A rank-one edit targeting one class perturbs shared directions others depend on.</w:t>
       </w:r>
     </w:p>
     <w:p>
@@ -687,7 +686,7 @@
           <w:i/>
           <w:sz w:val="22"/>
         </w:rPr>
-        <w:t>Table 6. Scaling: FDR, monosemanticity, circuit size, sparsity, accuracy vs. width (10 seeds).</w:t>
+        <w:t>Table 6. Scaling: FDR, class selectivity, class-selective unit count, sparsity, accuracy vs. width (10 seeds).</w:t>
       </w:r>
     </w:p>
     <w:p>
@@ -698,7 +697,7 @@
           <w:i w:val="0"/>
           <w:sz w:val="22"/>
         </w:rPr>
-        <w:t>FDR drops from 0.862 at 16 units to 0.387 at 1,024 units. Clean-model CKA at the ReLU stays stable (0.83–0.90). Monosemanticity falls from 26.9% to 7.5%. Circuit size shrinks from 6.6 to 0.0 units per class. Wider networks distribute class information across more directions. Individual circuit elements become less specialized, and memorized associations become harder to isolate.</w:t>
+        <w:t>FDR drops from 0.862 at 16 units to 0.387 at 1,024 units. Clean-model CKA at the ReLU stays stable (0.83–0.90). Class selectivity falls from 26.9% to 7.5%. Class-selective unit count shrinks from 6.6 to 0.0 units per class. Wider networks distribute class information across more directions. Individual hidden units become less specialized, and memorized associations become harder to isolate.</w:t>
       </w:r>
     </w:p>
     <w:p>
@@ -731,7 +730,7 @@
           <w:i w:val="0"/>
           <w:sz w:val="22"/>
         </w:rPr>
-        <w:t>The four phases give a mixed picture. Phases 1–3 show that random label noise correlates with measurable changes in weight norms, post-activation representations, and loss distributions. Phase 4 shows that targeted rank-one edits can partially reverse memorized associations in a different corruption setting. The strongest single result is the CKA drop at the ReLU: it localizes memorization to the nonlinearity rather than the linear projection. The rank-one intervention confirms that edit direction carries meaningful information. The weakest result is the influence classifier (AUC 0.514), which is statistically detectable but practically useless as a detector.</w:t>
+        <w:t>The four phases give a mixed picture. Phases 1–3 show that random label noise correlates with measurable changes in weight norms, post-activation representations, and loss distributions. Phase 4 shows that targeted rank-one edits can partially reverse memorized associations in a different corruption setting. The strongest single result is the CKA drop at the ReLU: it appears after the ReLU nonlinearity rather than the linear projection. The rank-one intervention confirms that edit direction carries meaningful information. The weakest result is the influence classifier (AUC 0.514), which is statistically detectable but practically useless as a detector.</w:t>
       </w:r>
     </w:p>
     <w:p>
@@ -797,7 +796,7 @@
           <w:i w:val="0"/>
           <w:sz w:val="22"/>
         </w:rPr>
-        <w:t>Third, FDR and monosemanticity degrade at wider widths. The rank-one editing approach may be an artifact of the 16-unit bottleneck and may not transfer to wider networks.</w:t>
+        <w:t>Third, FDR and class selectivity degrade at wider widths. The rank-one editing approach may be an artifact of the 16-unit bottleneck and may not transfer to wider networks.</w:t>
       </w:r>
     </w:p>
     <w:p>

</xml_diff>